<commit_message>
Transfer data from PDF Bill of Lading to DOCX template
Transferred all data fields from the PDF (Southern Star Int'l Logistics B/L
D6226010192) into the DOCX Bill of Lading template while preserving the
original DOCX structure, formatting, images, and layout.

Data transferred:
- B/L No: D6226010192
- Reference No: 265727572
- Shipper: DANANG RUBBER JOINT STOCK COMPANY
- Consignee: MEILAN LLC
- Notify Party: MEILAN LLC
- Vessel: MAERSK KWANGYANG V.603B
- Ports: DA NANG / GDANSK
- Container: UETU8355694/ML-VN4987283/40HQ
- Cargo: 29375 PCS TYRES AND TUBES
- Weight: 19334.500 KGS / 76.000 CBM
- Forwarding Agent: TANIT GROUP LLC
- LADEN ON BOARD: 2026-02-02
- Company: SOUTHERN STAR INT'L LOGISTICS CO., LTD
- B/L TELEX RELEASE

Co-authored-by: Alex Burchenko <alex070806@users.noreply.github.com>
</commit_message>
<xml_diff>
--- a/ZH240656424.docx
+++ b/ZH240656424.docx
@@ -106,7 +106,7 @@
                 <w:spacing w:val="-2"/>
                 <w:sz w:val="20"/>
               </w:rPr>
-              <w:t>NO:ZH240656424</w:t>
+              <w:t>NO:D6226010192</w:t>
             </w:r>
           </w:p>
           <w:p>
@@ -118,6 +118,14 @@
                 <w:sz w:val="20"/>
               </w:rPr>
             </w:pPr>
+            <w:r>
+              <w:rPr>
+                <w:rFonts w:ascii="Cambria" w:hAnsi="Cambria"/>
+                <w:b/>
+                <w:sz w:val="20"/>
+              </w:rPr>
+              <w:t>Reference No. 265727572</w:t>
+            </w:r>
           </w:p>
           <w:p>
             <w:pPr>
@@ -226,7 +234,7 @@
                 <w:w w:val="80"/>
                 <w:sz w:val="24"/>
               </w:rPr>
-              <w:t>UNICORN(SHENZHEN)SUPPLY</w:t>
+              <w:t>SOUTHERN STAR INT'L LOGISTICS CO.,LTD</w:t>
             </w:r>
             <w:r>
               <w:rPr>
@@ -244,7 +252,6 @@
                 <w:w w:val="80"/>
                 <w:sz w:val="24"/>
               </w:rPr>
-              <w:t>CHAIN</w:t>
             </w:r>
             <w:r>
               <w:rPr>
@@ -263,7 +270,6 @@
                 <w:w w:val="80"/>
                 <w:sz w:val="24"/>
               </w:rPr>
-              <w:t>CO.,LTD.</w:t>
             </w:r>
           </w:p>
           <w:p>
@@ -283,7 +289,6 @@
                 <w:b/>
                 <w:sz w:val="24"/>
               </w:rPr>
-              <w:t>BILL</w:t>
             </w:r>
             <w:r>
               <w:rPr>
@@ -292,7 +297,6 @@
                 <w:spacing w:val="32"/>
                 <w:sz w:val="24"/>
               </w:rPr>
-              <w:t> </w:t>
             </w:r>
             <w:r>
               <w:rPr>
@@ -300,7 +304,6 @@
                 <w:b/>
                 <w:sz w:val="24"/>
               </w:rPr>
-              <w:t>OF</w:t>
             </w:r>
             <w:r>
               <w:rPr>
@@ -309,7 +312,6 @@
                 <w:spacing w:val="32"/>
                 <w:sz w:val="24"/>
               </w:rPr>
-              <w:t> </w:t>
             </w:r>
             <w:r>
               <w:rPr>
@@ -318,7 +320,6 @@
                 <w:spacing w:val="-2"/>
                 <w:sz w:val="24"/>
               </w:rPr>
-              <w:t>LADING</w:t>
             </w:r>
           </w:p>
           <w:p>
@@ -339,7 +340,7 @@
                 <w:w w:val="80"/>
                 <w:sz w:val="24"/>
               </w:rPr>
-              <w:t>(COMBINED</w:t>
+              <w:t>COMBINED</w:t>
             </w:r>
             <w:r>
               <w:rPr>
@@ -348,7 +349,7 @@
                 <w:spacing w:val="32"/>
                 <w:sz w:val="24"/>
               </w:rPr>
-              <w:t> </w:t>
+              <w:t xml:space="preserve"> </w:t>
             </w:r>
             <w:r>
               <w:rPr>
@@ -357,7 +358,7 @@
                 <w:w w:val="80"/>
                 <w:sz w:val="24"/>
               </w:rPr>
-              <w:t>TRANSPORT/PORT</w:t>
+              <w:t>TRANSPORT</w:t>
             </w:r>
             <w:r>
               <w:rPr>
@@ -366,7 +367,7 @@
                 <w:spacing w:val="36"/>
                 <w:sz w:val="24"/>
               </w:rPr>
-              <w:t> </w:t>
+              <w:t xml:space="preserve"> </w:t>
             </w:r>
             <w:r>
               <w:rPr>
@@ -375,7 +376,7 @@
                 <w:w w:val="80"/>
                 <w:sz w:val="24"/>
               </w:rPr>
-              <w:t>TO</w:t>
+              <w:t>BILL</w:t>
             </w:r>
             <w:r>
               <w:rPr>
@@ -384,7 +385,7 @@
                 <w:spacing w:val="35"/>
                 <w:sz w:val="24"/>
               </w:rPr>
-              <w:t> </w:t>
+              <w:t xml:space="preserve"> </w:t>
             </w:r>
             <w:r>
               <w:rPr>
@@ -393,7 +394,7 @@
                 <w:w w:val="80"/>
                 <w:sz w:val="24"/>
               </w:rPr>
-              <w:t>PORT)</w:t>
+              <w:t>OF</w:t>
             </w:r>
             <w:r>
               <w:rPr>
@@ -402,7 +403,7 @@
                 <w:spacing w:val="36"/>
                 <w:sz w:val="24"/>
               </w:rPr>
-              <w:t> </w:t>
+              <w:t xml:space="preserve"> </w:t>
             </w:r>
             <w:r>
               <w:rPr>
@@ -412,7 +413,7 @@
                 <w:w w:val="80"/>
                 <w:sz w:val="24"/>
               </w:rPr>
-              <w:t>COPY</w:t>
+              <w:t>LADING</w:t>
             </w:r>
           </w:p>
           <w:p>
@@ -434,7 +435,6 @@
                 <w:w w:val="90"/>
                 <w:sz w:val="24"/>
               </w:rPr>
-              <w:t>NON-</w:t>
             </w:r>
             <w:r>
               <w:rPr>
@@ -443,7 +443,6 @@
                 <w:spacing w:val="-2"/>
                 <w:sz w:val="24"/>
               </w:rPr>
-              <w:t>NEGOTIABLE</w:t>
             </w:r>
           </w:p>
         </w:tc>
@@ -473,86 +472,74 @@
               <w:rPr>
                 <w:sz w:val="18"/>
               </w:rPr>
-              <w:t>TRINA</w:t>
+              <w:t>DANANG RUBBER JOINT STOCK COMPANY</w:t>
             </w:r>
             <w:r>
               <w:rPr>
                 <w:spacing w:val="-6"/>
                 <w:sz w:val="18"/>
               </w:rPr>
-              <w:t> </w:t>
-            </w:r>
-            <w:r>
-              <w:rPr>
-                <w:sz w:val="18"/>
-              </w:rPr>
-              <w:t>SOLAR</w:t>
+            </w:r>
+            <w:r>
+              <w:rPr>
+                <w:sz w:val="18"/>
+              </w:rPr>
             </w:r>
             <w:r>
               <w:rPr>
                 <w:spacing w:val="-6"/>
                 <w:sz w:val="18"/>
               </w:rPr>
-              <w:t> </w:t>
-            </w:r>
-            <w:r>
-              <w:rPr>
-                <w:sz w:val="18"/>
-              </w:rPr>
-              <w:t>(HUAI</w:t>
+            </w:r>
+            <w:r>
+              <w:rPr>
+                <w:sz w:val="18"/>
+              </w:rPr>
             </w:r>
             <w:r>
               <w:rPr>
                 <w:spacing w:val="-6"/>
                 <w:sz w:val="18"/>
               </w:rPr>
-              <w:t> </w:t>
-            </w:r>
-            <w:r>
-              <w:rPr>
-                <w:sz w:val="18"/>
-              </w:rPr>
-              <w:t>AN)</w:t>
+            </w:r>
+            <w:r>
+              <w:rPr>
+                <w:sz w:val="18"/>
+              </w:rPr>
             </w:r>
             <w:r>
               <w:rPr>
                 <w:spacing w:val="-6"/>
                 <w:sz w:val="18"/>
               </w:rPr>
-              <w:t> </w:t>
-            </w:r>
-            <w:r>
-              <w:rPr>
-                <w:sz w:val="18"/>
-              </w:rPr>
-              <w:t>TECHNOLOGY</w:t>
+            </w:r>
+            <w:r>
+              <w:rPr>
+                <w:sz w:val="18"/>
+              </w:rPr>
             </w:r>
             <w:r>
               <w:rPr>
                 <w:spacing w:val="-6"/>
                 <w:sz w:val="18"/>
               </w:rPr>
-              <w:t> </w:t>
-            </w:r>
-            <w:r>
-              <w:rPr>
-                <w:sz w:val="18"/>
-              </w:rPr>
-              <w:t>CO.,</w:t>
+            </w:r>
+            <w:r>
+              <w:rPr>
+                <w:sz w:val="18"/>
+              </w:rPr>
             </w:r>
             <w:r>
               <w:rPr>
                 <w:spacing w:val="-6"/>
                 <w:sz w:val="18"/>
               </w:rPr>
-              <w:t> </w:t>
             </w:r>
             <w:r>
               <w:rPr>
                 <w:spacing w:val="-4"/>
                 <w:sz w:val="18"/>
               </w:rPr>
-              <w:t>LTD.</w:t>
             </w:r>
           </w:p>
         </w:tc>
@@ -601,86 +588,74 @@
               <w:rPr>
                 <w:sz w:val="18"/>
               </w:rPr>
-              <w:t>NO.189,</w:t>
+              <w:t>LOT G, TA QUANG BUU ST, HAI VAN WARD, DANANG CITY,</w:t>
             </w:r>
             <w:r>
               <w:rPr>
                 <w:spacing w:val="-8"/>
                 <w:sz w:val="18"/>
               </w:rPr>
-              <w:t> </w:t>
-            </w:r>
-            <w:r>
-              <w:rPr>
-                <w:sz w:val="18"/>
-              </w:rPr>
-              <w:t>SHENZHEN</w:t>
+            </w:r>
+            <w:r>
+              <w:rPr>
+                <w:sz w:val="18"/>
+              </w:rPr>
             </w:r>
             <w:r>
               <w:rPr>
                 <w:spacing w:val="-7"/>
                 <w:sz w:val="18"/>
               </w:rPr>
-              <w:t> </w:t>
-            </w:r>
-            <w:r>
-              <w:rPr>
-                <w:sz w:val="18"/>
-              </w:rPr>
-              <w:t>EAST</w:t>
+            </w:r>
+            <w:r>
+              <w:rPr>
+                <w:sz w:val="18"/>
+              </w:rPr>
             </w:r>
             <w:r>
               <w:rPr>
                 <w:spacing w:val="-7"/>
                 <w:sz w:val="18"/>
               </w:rPr>
-              <w:t> </w:t>
-            </w:r>
-            <w:r>
-              <w:rPr>
-                <w:sz w:val="18"/>
-              </w:rPr>
-              <w:t>ROAD,</w:t>
+            </w:r>
+            <w:r>
+              <w:rPr>
+                <w:sz w:val="18"/>
+              </w:rPr>
             </w:r>
             <w:r>
               <w:rPr>
                 <w:spacing w:val="-7"/>
                 <w:sz w:val="18"/>
               </w:rPr>
-              <w:t> </w:t>
-            </w:r>
-            <w:r>
-              <w:rPr>
-                <w:sz w:val="18"/>
-              </w:rPr>
-              <w:t>HUAI'AN</w:t>
+            </w:r>
+            <w:r>
+              <w:rPr>
+                <w:sz w:val="18"/>
+              </w:rPr>
             </w:r>
             <w:r>
               <w:rPr>
                 <w:spacing w:val="-7"/>
                 <w:sz w:val="18"/>
               </w:rPr>
-              <w:t> </w:t>
-            </w:r>
-            <w:r>
-              <w:rPr>
-                <w:sz w:val="18"/>
-              </w:rPr>
-              <w:t>ECONOMIC</w:t>
+            </w:r>
+            <w:r>
+              <w:rPr>
+                <w:sz w:val="18"/>
+              </w:rPr>
             </w:r>
             <w:r>
               <w:rPr>
                 <w:spacing w:val="-7"/>
                 <w:sz w:val="18"/>
               </w:rPr>
-              <w:t> </w:t>
             </w:r>
             <w:r>
               <w:rPr>
                 <w:spacing w:val="-5"/>
                 <w:sz w:val="18"/>
               </w:rPr>
-              <w:t>AND</w:t>
             </w:r>
           </w:p>
         </w:tc>
@@ -729,60 +704,52 @@
               <w:rPr>
                 <w:sz w:val="18"/>
               </w:rPr>
-              <w:t>TECHNOLOGICAL</w:t>
+              <w:t>VIETNAM</w:t>
             </w:r>
             <w:r>
               <w:rPr>
                 <w:spacing w:val="-10"/>
                 <w:sz w:val="18"/>
               </w:rPr>
-              <w:t> </w:t>
-            </w:r>
-            <w:r>
-              <w:rPr>
-                <w:sz w:val="18"/>
-              </w:rPr>
-              <w:t>DEVELOPMENT</w:t>
+            </w:r>
+            <w:r>
+              <w:rPr>
+                <w:sz w:val="18"/>
+              </w:rPr>
             </w:r>
             <w:r>
               <w:rPr>
                 <w:spacing w:val="-10"/>
                 <w:sz w:val="18"/>
               </w:rPr>
-              <w:t> </w:t>
-            </w:r>
-            <w:r>
-              <w:rPr>
-                <w:sz w:val="18"/>
-              </w:rPr>
-              <w:t>ZONE,</w:t>
+            </w:r>
+            <w:r>
+              <w:rPr>
+                <w:sz w:val="18"/>
+              </w:rPr>
             </w:r>
             <w:r>
               <w:rPr>
                 <w:spacing w:val="-10"/>
                 <w:sz w:val="18"/>
               </w:rPr>
-              <w:t> </w:t>
-            </w:r>
-            <w:r>
-              <w:rPr>
-                <w:sz w:val="18"/>
-              </w:rPr>
-              <w:t>JIANGSU</w:t>
+            </w:r>
+            <w:r>
+              <w:rPr>
+                <w:sz w:val="18"/>
+              </w:rPr>
             </w:r>
             <w:r>
               <w:rPr>
                 <w:spacing w:val="-10"/>
                 <w:sz w:val="18"/>
               </w:rPr>
-              <w:t> </w:t>
             </w:r>
             <w:r>
               <w:rPr>
                 <w:spacing w:val="-2"/>
                 <w:sz w:val="18"/>
               </w:rPr>
-              <w:t>PROVINCE,</w:t>
             </w:r>
           </w:p>
         </w:tc>
@@ -831,105 +798,89 @@
               <w:rPr>
                 <w:sz w:val="18"/>
               </w:rPr>
-              <w:t>P.R.</w:t>
             </w:r>
             <w:r>
               <w:rPr>
                 <w:spacing w:val="-6"/>
                 <w:sz w:val="18"/>
               </w:rPr>
-              <w:t> </w:t>
-            </w:r>
-            <w:r>
-              <w:rPr>
-                <w:sz w:val="18"/>
-              </w:rPr>
-              <w:t>CHINA</w:t>
+            </w:r>
+            <w:r>
+              <w:rPr>
+                <w:sz w:val="18"/>
+              </w:rPr>
             </w:r>
             <w:r>
               <w:rPr>
                 <w:spacing w:val="-5"/>
                 <w:sz w:val="18"/>
               </w:rPr>
-              <w:t> </w:t>
-            </w:r>
-            <w:r>
-              <w:rPr>
-                <w:sz w:val="18"/>
-              </w:rPr>
-              <w:t>ON</w:t>
+            </w:r>
+            <w:r>
+              <w:rPr>
+                <w:sz w:val="18"/>
+              </w:rPr>
             </w:r>
             <w:r>
               <w:rPr>
                 <w:spacing w:val="-5"/>
                 <w:sz w:val="18"/>
               </w:rPr>
-              <w:t> </w:t>
-            </w:r>
-            <w:r>
-              <w:rPr>
-                <w:sz w:val="18"/>
-              </w:rPr>
-              <w:t>BEHALF</w:t>
+            </w:r>
+            <w:r>
+              <w:rPr>
+                <w:sz w:val="18"/>
+              </w:rPr>
             </w:r>
             <w:r>
               <w:rPr>
                 <w:spacing w:val="-5"/>
                 <w:sz w:val="18"/>
               </w:rPr>
-              <w:t> </w:t>
-            </w:r>
-            <w:r>
-              <w:rPr>
-                <w:sz w:val="18"/>
-              </w:rPr>
-              <w:t>OF</w:t>
+            </w:r>
+            <w:r>
+              <w:rPr>
+                <w:sz w:val="18"/>
+              </w:rPr>
             </w:r>
             <w:r>
               <w:rPr>
                 <w:spacing w:val="-6"/>
                 <w:sz w:val="18"/>
               </w:rPr>
-              <w:t> </w:t>
-            </w:r>
-            <w:r>
-              <w:rPr>
-                <w:sz w:val="18"/>
-              </w:rPr>
-              <w:t>TRINA</w:t>
+            </w:r>
+            <w:r>
+              <w:rPr>
+                <w:sz w:val="18"/>
+              </w:rPr>
             </w:r>
             <w:r>
               <w:rPr>
                 <w:spacing w:val="-5"/>
                 <w:sz w:val="18"/>
               </w:rPr>
-              <w:t> </w:t>
-            </w:r>
-            <w:r>
-              <w:rPr>
-                <w:sz w:val="18"/>
-              </w:rPr>
-              <w:t>SOLAR</w:t>
+            </w:r>
+            <w:r>
+              <w:rPr>
+                <w:sz w:val="18"/>
+              </w:rPr>
             </w:r>
             <w:r>
               <w:rPr>
                 <w:spacing w:val="-5"/>
                 <w:sz w:val="18"/>
               </w:rPr>
-              <w:t> </w:t>
-            </w:r>
-            <w:r>
-              <w:rPr>
-                <w:sz w:val="18"/>
-              </w:rPr>
-              <w:t>(SCHWEIZ)</w:t>
+            </w:r>
+            <w:r>
+              <w:rPr>
+                <w:sz w:val="18"/>
+              </w:rPr>
             </w:r>
             <w:r>
               <w:rPr>
                 <w:spacing w:val="-5"/>
                 <w:sz w:val="18"/>
               </w:rPr>
-              <w:t> AG</w:t>
             </w:r>
           </w:p>
         </w:tc>
@@ -978,34 +929,29 @@
               <w:rPr>
                 <w:sz w:val="18"/>
               </w:rPr>
-              <w:t>BIRKENWEG</w:t>
             </w:r>
             <w:r>
               <w:rPr>
                 <w:spacing w:val="-6"/>
                 <w:sz w:val="18"/>
               </w:rPr>
-              <w:t> </w:t>
-            </w:r>
-            <w:r>
-              <w:rPr>
-                <w:sz w:val="18"/>
-              </w:rPr>
-              <w:t>4</w:t>
+            </w:r>
+            <w:r>
+              <w:rPr>
+                <w:sz w:val="18"/>
+              </w:rPr>
             </w:r>
             <w:r>
               <w:rPr>
                 <w:spacing w:val="-5"/>
                 <w:sz w:val="18"/>
               </w:rPr>
-              <w:t> </w:t>
             </w:r>
             <w:r>
               <w:rPr>
                 <w:spacing w:val="-4"/>
                 <w:sz w:val="18"/>
               </w:rPr>
-              <w:t>8304</w:t>
             </w:r>
           </w:p>
         </w:tc>
@@ -1055,21 +1001,18 @@
               <w:rPr>
                 <w:sz w:val="18"/>
               </w:rPr>
-              <w:t>WALLISELLEN</w:t>
             </w:r>
             <w:r>
               <w:rPr>
                 <w:spacing w:val="-13"/>
                 <w:sz w:val="18"/>
               </w:rPr>
-              <w:t> </w:t>
             </w:r>
             <w:r>
               <w:rPr>
                 <w:spacing w:val="-2"/>
                 <w:sz w:val="18"/>
               </w:rPr>
-              <w:t>SWITZERLAND</w:t>
             </w:r>
           </w:p>
         </w:tc>
@@ -1205,21 +1148,19 @@
               <w:rPr>
                 <w:sz w:val="18"/>
               </w:rPr>
-              <w:t>LLC</w:t>
+              <w:t>MEILAN LLC</w:t>
             </w:r>
             <w:r>
               <w:rPr>
                 <w:spacing w:val="-4"/>
                 <w:sz w:val="18"/>
               </w:rPr>
-              <w:t> </w:t>
             </w:r>
             <w:r>
               <w:rPr>
                 <w:spacing w:val="-2"/>
                 <w:sz w:val="18"/>
               </w:rPr>
-              <w:t>"ENERGOKREATIV"</w:t>
             </w:r>
           </w:p>
         </w:tc>
@@ -1267,125 +1208,107 @@
               <w:rPr>
                 <w:sz w:val="18"/>
               </w:rPr>
-              <w:t>Address:8</w:t>
+              <w:t>ADDRESS:BUILDING 3,NOVOMOSKOVSKA DOROGA,</w:t>
             </w:r>
             <w:r>
               <w:rPr>
                 <w:spacing w:val="-6"/>
                 <w:sz w:val="18"/>
               </w:rPr>
-              <w:t> </w:t>
-            </w:r>
-            <w:r>
-              <w:rPr>
-                <w:sz w:val="18"/>
-              </w:rPr>
-              <w:t>of.</w:t>
+            </w:r>
+            <w:r>
+              <w:rPr>
+                <w:sz w:val="18"/>
+              </w:rPr>
             </w:r>
             <w:r>
               <w:rPr>
                 <w:spacing w:val="-6"/>
                 <w:sz w:val="18"/>
               </w:rPr>
-              <w:t> </w:t>
-            </w:r>
-            <w:r>
-              <w:rPr>
-                <w:sz w:val="18"/>
-              </w:rPr>
-              <w:t>2</w:t>
+            </w:r>
+            <w:r>
+              <w:rPr>
+                <w:sz w:val="18"/>
+              </w:rPr>
             </w:r>
             <w:r>
               <w:rPr>
                 <w:spacing w:val="-6"/>
                 <w:sz w:val="18"/>
               </w:rPr>
-              <w:t> </w:t>
-            </w:r>
-            <w:r>
-              <w:rPr>
-                <w:sz w:val="18"/>
-              </w:rPr>
-              <w:t>b</w:t>
+            </w:r>
+            <w:r>
+              <w:rPr>
+                <w:sz w:val="18"/>
+              </w:rPr>
             </w:r>
             <w:r>
               <w:rPr>
                 <w:spacing w:val="-6"/>
                 <w:sz w:val="18"/>
               </w:rPr>
-              <w:t> </w:t>
-            </w:r>
-            <w:r>
-              <w:rPr>
-                <w:sz w:val="18"/>
-              </w:rPr>
-              <w:t>bld.</w:t>
+            </w:r>
+            <w:r>
+              <w:rPr>
+                <w:sz w:val="18"/>
+              </w:rPr>
             </w:r>
             <w:r>
               <w:rPr>
                 <w:spacing w:val="-6"/>
                 <w:sz w:val="18"/>
               </w:rPr>
-              <w:t> </w:t>
-            </w:r>
-            <w:r>
-              <w:rPr>
-                <w:sz w:val="18"/>
-              </w:rPr>
-              <w:t>Akademika</w:t>
+            </w:r>
+            <w:r>
+              <w:rPr>
+                <w:sz w:val="18"/>
+              </w:rPr>
             </w:r>
             <w:r>
               <w:rPr>
                 <w:spacing w:val="-6"/>
                 <w:sz w:val="18"/>
               </w:rPr>
-              <w:t> </w:t>
-            </w:r>
-            <w:r>
-              <w:rPr>
-                <w:sz w:val="18"/>
-              </w:rPr>
-              <w:t>Hrushevskoho</w:t>
+            </w:r>
+            <w:r>
+              <w:rPr>
+                <w:sz w:val="18"/>
+              </w:rPr>
             </w:r>
             <w:r>
               <w:rPr>
                 <w:spacing w:val="-6"/>
                 <w:sz w:val="18"/>
               </w:rPr>
-              <w:t> </w:t>
-            </w:r>
-            <w:r>
-              <w:rPr>
-                <w:sz w:val="18"/>
-              </w:rPr>
-              <w:t>str.,</w:t>
+            </w:r>
+            <w:r>
+              <w:rPr>
+                <w:sz w:val="18"/>
+              </w:rPr>
             </w:r>
             <w:r>
               <w:rPr>
                 <w:spacing w:val="-6"/>
                 <w:sz w:val="18"/>
               </w:rPr>
-              <w:t> </w:t>
-            </w:r>
-            <w:r>
-              <w:rPr>
-                <w:sz w:val="18"/>
-              </w:rPr>
-              <w:t>Rivne</w:t>
+            </w:r>
+            <w:r>
+              <w:rPr>
+                <w:sz w:val="18"/>
+              </w:rPr>
             </w:r>
             <w:r>
               <w:rPr>
                 <w:spacing w:val="-6"/>
                 <w:sz w:val="18"/>
               </w:rPr>
-              <w:t> </w:t>
             </w:r>
             <w:r>
               <w:rPr>
                 <w:spacing w:val="-2"/>
                 <w:sz w:val="18"/>
               </w:rPr>
-              <w:t>city,</w:t>
             </w:r>
           </w:p>
         </w:tc>
@@ -1433,20 +1356,18 @@
               <w:rPr>
                 <w:sz w:val="18"/>
               </w:rPr>
-              <w:t>Tax</w:t>
+              <w:t>ODESSA CITY, ODESSA REGION,65031,UKRAINE</w:t>
             </w:r>
             <w:r>
               <w:rPr>
                 <w:spacing w:val="-7"/>
                 <w:sz w:val="18"/>
               </w:rPr>
-              <w:t> </w:t>
-            </w:r>
-            <w:r>
-              <w:rPr>
-                <w:sz w:val="18"/>
-              </w:rPr>
-              <w:t>number:</w:t>
+            </w:r>
+            <w:r>
+              <w:rPr>
+                <w:sz w:val="18"/>
+              </w:rPr>
             </w:r>
             <w:r>
               <w:rPr>
@@ -1454,14 +1375,12 @@
                 <w:w w:val="150"/>
                 <w:sz w:val="18"/>
               </w:rPr>
-              <w:t> </w:t>
             </w:r>
             <w:r>
               <w:rPr>
                 <w:spacing w:val="-2"/>
                 <w:sz w:val="18"/>
               </w:rPr>
-              <w:t>421763326577</w:t>
             </w:r>
           </w:p>
         </w:tc>
@@ -1509,14 +1428,12 @@
               <w:rPr>
                 <w:sz w:val="18"/>
               </w:rPr>
-              <w:t>E-mail:</w:t>
             </w:r>
             <w:r>
               <w:rPr>
                 <w:spacing w:val="-8"/>
                 <w:sz w:val="18"/>
               </w:rPr>
-              <w:t> </w:t>
             </w:r>
             <w:hyperlink r:id="rId6">
               <w:r>
@@ -1524,7 +1441,7 @@
                   <w:spacing w:val="-2"/>
                   <w:sz w:val="18"/>
                 </w:rPr>
-                <w:t>energokreatev@ukr.net</w:t>
+                <w:t/>
               </w:r>
             </w:hyperlink>
           </w:p>
@@ -1574,21 +1491,18 @@
               <w:rPr>
                 <w:sz w:val="18"/>
               </w:rPr>
-              <w:t>Tel:</w:t>
             </w:r>
             <w:r>
               <w:rPr>
                 <w:spacing w:val="-5"/>
                 <w:sz w:val="18"/>
               </w:rPr>
-              <w:t> </w:t>
             </w:r>
             <w:r>
               <w:rPr>
                 <w:spacing w:val="-2"/>
                 <w:sz w:val="18"/>
               </w:rPr>
-              <w:t>+380688344092</w:t>
             </w:r>
           </w:p>
         </w:tc>
@@ -1744,21 +1658,19 @@
               <w:rPr>
                 <w:sz w:val="18"/>
               </w:rPr>
-              <w:t>LLC</w:t>
+              <w:t>MEILAN LLC</w:t>
             </w:r>
             <w:r>
               <w:rPr>
                 <w:spacing w:val="-4"/>
                 <w:sz w:val="18"/>
               </w:rPr>
-              <w:t> </w:t>
             </w:r>
             <w:r>
               <w:rPr>
                 <w:spacing w:val="-2"/>
                 <w:sz w:val="18"/>
               </w:rPr>
-              <w:t>"ENERGOKREATIV"</w:t>
             </w:r>
           </w:p>
         </w:tc>
@@ -1806,125 +1718,107 @@
               <w:rPr>
                 <w:sz w:val="18"/>
               </w:rPr>
-              <w:t>Address:8</w:t>
+              <w:t>ADDRESS:BUILDING 3,NOVOMOSKOVSKA DOROGA,</w:t>
             </w:r>
             <w:r>
               <w:rPr>
                 <w:spacing w:val="-6"/>
                 <w:sz w:val="18"/>
               </w:rPr>
-              <w:t> </w:t>
-            </w:r>
-            <w:r>
-              <w:rPr>
-                <w:sz w:val="18"/>
-              </w:rPr>
-              <w:t>of.</w:t>
+            </w:r>
+            <w:r>
+              <w:rPr>
+                <w:sz w:val="18"/>
+              </w:rPr>
             </w:r>
             <w:r>
               <w:rPr>
                 <w:spacing w:val="-6"/>
                 <w:sz w:val="18"/>
               </w:rPr>
-              <w:t> </w:t>
-            </w:r>
-            <w:r>
-              <w:rPr>
-                <w:sz w:val="18"/>
-              </w:rPr>
-              <w:t>2</w:t>
+            </w:r>
+            <w:r>
+              <w:rPr>
+                <w:sz w:val="18"/>
+              </w:rPr>
             </w:r>
             <w:r>
               <w:rPr>
                 <w:spacing w:val="-6"/>
                 <w:sz w:val="18"/>
               </w:rPr>
-              <w:t> </w:t>
-            </w:r>
-            <w:r>
-              <w:rPr>
-                <w:sz w:val="18"/>
-              </w:rPr>
-              <w:t>b</w:t>
+            </w:r>
+            <w:r>
+              <w:rPr>
+                <w:sz w:val="18"/>
+              </w:rPr>
             </w:r>
             <w:r>
               <w:rPr>
                 <w:spacing w:val="-6"/>
                 <w:sz w:val="18"/>
               </w:rPr>
-              <w:t> </w:t>
-            </w:r>
-            <w:r>
-              <w:rPr>
-                <w:sz w:val="18"/>
-              </w:rPr>
-              <w:t>bld.</w:t>
+            </w:r>
+            <w:r>
+              <w:rPr>
+                <w:sz w:val="18"/>
+              </w:rPr>
             </w:r>
             <w:r>
               <w:rPr>
                 <w:spacing w:val="-6"/>
                 <w:sz w:val="18"/>
               </w:rPr>
-              <w:t> </w:t>
-            </w:r>
-            <w:r>
-              <w:rPr>
-                <w:sz w:val="18"/>
-              </w:rPr>
-              <w:t>Akademika</w:t>
+            </w:r>
+            <w:r>
+              <w:rPr>
+                <w:sz w:val="18"/>
+              </w:rPr>
             </w:r>
             <w:r>
               <w:rPr>
                 <w:spacing w:val="-6"/>
                 <w:sz w:val="18"/>
               </w:rPr>
-              <w:t> </w:t>
-            </w:r>
-            <w:r>
-              <w:rPr>
-                <w:sz w:val="18"/>
-              </w:rPr>
-              <w:t>Hrushevskoho</w:t>
+            </w:r>
+            <w:r>
+              <w:rPr>
+                <w:sz w:val="18"/>
+              </w:rPr>
             </w:r>
             <w:r>
               <w:rPr>
                 <w:spacing w:val="-6"/>
                 <w:sz w:val="18"/>
               </w:rPr>
-              <w:t> </w:t>
-            </w:r>
-            <w:r>
-              <w:rPr>
-                <w:sz w:val="18"/>
-              </w:rPr>
-              <w:t>str.,</w:t>
+            </w:r>
+            <w:r>
+              <w:rPr>
+                <w:sz w:val="18"/>
+              </w:rPr>
             </w:r>
             <w:r>
               <w:rPr>
                 <w:spacing w:val="-6"/>
                 <w:sz w:val="18"/>
               </w:rPr>
-              <w:t> </w:t>
-            </w:r>
-            <w:r>
-              <w:rPr>
-                <w:sz w:val="18"/>
-              </w:rPr>
-              <w:t>Rivne</w:t>
+            </w:r>
+            <w:r>
+              <w:rPr>
+                <w:sz w:val="18"/>
+              </w:rPr>
             </w:r>
             <w:r>
               <w:rPr>
                 <w:spacing w:val="-6"/>
                 <w:sz w:val="18"/>
               </w:rPr>
-              <w:t> </w:t>
             </w:r>
             <w:r>
               <w:rPr>
                 <w:spacing w:val="-2"/>
                 <w:sz w:val="18"/>
               </w:rPr>
-              <w:t>city,</w:t>
             </w:r>
           </w:p>
         </w:tc>
@@ -1972,20 +1866,18 @@
               <w:rPr>
                 <w:sz w:val="18"/>
               </w:rPr>
-              <w:t>Tax</w:t>
+              <w:t>ODESSA CITY, ODESSA REGION,65031,UKRAINE</w:t>
             </w:r>
             <w:r>
               <w:rPr>
                 <w:spacing w:val="-7"/>
                 <w:sz w:val="18"/>
               </w:rPr>
-              <w:t> </w:t>
-            </w:r>
-            <w:r>
-              <w:rPr>
-                <w:sz w:val="18"/>
-              </w:rPr>
-              <w:t>number:</w:t>
+            </w:r>
+            <w:r>
+              <w:rPr>
+                <w:sz w:val="18"/>
+              </w:rPr>
             </w:r>
             <w:r>
               <w:rPr>
@@ -1993,14 +1885,12 @@
                 <w:w w:val="150"/>
                 <w:sz w:val="18"/>
               </w:rPr>
-              <w:t> </w:t>
             </w:r>
             <w:r>
               <w:rPr>
                 <w:spacing w:val="-2"/>
                 <w:sz w:val="18"/>
               </w:rPr>
-              <w:t>421763326577</w:t>
             </w:r>
           </w:p>
         </w:tc>
@@ -2048,14 +1938,12 @@
               <w:rPr>
                 <w:sz w:val="18"/>
               </w:rPr>
-              <w:t>E-mail:</w:t>
             </w:r>
             <w:r>
               <w:rPr>
                 <w:spacing w:val="-8"/>
                 <w:sz w:val="18"/>
               </w:rPr>
-              <w:t> </w:t>
             </w:r>
             <w:hyperlink r:id="rId6">
               <w:r>
@@ -2063,7 +1951,7 @@
                   <w:spacing w:val="-2"/>
                   <w:sz w:val="18"/>
                 </w:rPr>
-                <w:t>energokreatev@ukr.net</w:t>
+                <w:t/>
               </w:r>
             </w:hyperlink>
           </w:p>
@@ -2113,21 +2001,18 @@
               <w:rPr>
                 <w:sz w:val="18"/>
               </w:rPr>
-              <w:t>Tel:</w:t>
             </w:r>
             <w:r>
               <w:rPr>
                 <w:spacing w:val="-5"/>
                 <w:sz w:val="18"/>
               </w:rPr>
-              <w:t> </w:t>
             </w:r>
             <w:r>
               <w:rPr>
                 <w:spacing w:val="-2"/>
                 <w:sz w:val="18"/>
               </w:rPr>
-              <w:t>+380688344092</w:t>
             </w:r>
           </w:p>
         </w:tc>
@@ -2267,6 +2152,14 @@
               <w:t>Receipt</w:t>
             </w:r>
           </w:p>
+          <w:p>
+            <w:r>
+              <w:rPr>
+                <w:sz w:val="18"/>
+              </w:rPr>
+              <w:t>DA NANG, VIET NAM</w:t>
+            </w:r>
+          </w:p>
         </w:tc>
         <w:tc>
           <w:tcPr>
@@ -2315,6 +2208,38 @@
                 <w:sz w:val="18"/>
               </w:rPr>
               <w:t>agent-references</w:t>
+            </w:r>
+          </w:p>
+          <w:p>
+            <w:r>
+              <w:rPr>
+                <w:sz w:val="18"/>
+              </w:rPr>
+              <w:t>TANIT GROUP LLC</w:t>
+            </w:r>
+          </w:p>
+          <w:p>
+            <w:r>
+              <w:rPr>
+                <w:sz w:val="18"/>
+              </w:rPr>
+              <w:t>68000, ODESA REGION, CHORNOMORSK,</w:t>
+            </w:r>
+          </w:p>
+          <w:p>
+            <w:r>
+              <w:rPr>
+                <w:sz w:val="18"/>
+              </w:rPr>
+              <w:t>KORABELNA STREET, 3/32N</w:t>
+            </w:r>
+          </w:p>
+          <w:p>
+            <w:r>
+              <w:rPr>
+                <w:sz w:val="18"/>
+              </w:rPr>
+              <w:t>TEL.:+38-048-7802418</w:t>
             </w:r>
           </w:p>
         </w:tc>
@@ -2358,7 +2283,7 @@
                 <w:spacing w:val="34"/>
                 <w:sz w:val="18"/>
               </w:rPr>
-              <w:t> </w:t>
+              <w:t xml:space="preserve"> </w:t>
             </w:r>
             <w:r>
               <w:rPr>
@@ -2383,53 +2308,46 @@
               <w:rPr>
                 <w:sz w:val="18"/>
               </w:rPr>
-              <w:t>DA</w:t>
+              <w:t>MAERSK KWANGYANG V.603B</w:t>
             </w:r>
             <w:r>
               <w:rPr>
                 <w:spacing w:val="-3"/>
                 <w:sz w:val="18"/>
               </w:rPr>
-              <w:t> </w:t>
-            </w:r>
-            <w:r>
-              <w:rPr>
-                <w:sz w:val="18"/>
-              </w:rPr>
-              <w:t>XIN</w:t>
+            </w:r>
+            <w:r>
+              <w:rPr>
+                <w:sz w:val="18"/>
+              </w:rPr>
             </w:r>
             <w:r>
               <w:rPr>
                 <w:spacing w:val="-2"/>
                 <w:sz w:val="18"/>
               </w:rPr>
-              <w:t> </w:t>
-            </w:r>
-            <w:r>
-              <w:rPr>
-                <w:sz w:val="18"/>
-              </w:rPr>
-              <w:t>77</w:t>
+            </w:r>
+            <w:r>
+              <w:rPr>
+                <w:sz w:val="18"/>
+              </w:rPr>
             </w:r>
             <w:r>
               <w:rPr>
                 <w:spacing w:val="-2"/>
                 <w:sz w:val="18"/>
               </w:rPr>
-              <w:t> </w:t>
-            </w:r>
-            <w:r>
-              <w:rPr>
-                <w:sz w:val="18"/>
-              </w:rPr>
-              <w:t>-</w:t>
+            </w:r>
+            <w:r>
+              <w:rPr>
+                <w:sz w:val="18"/>
+              </w:rPr>
             </w:r>
             <w:r>
               <w:rPr>
                 <w:spacing w:val="-2"/>
                 <w:sz w:val="18"/>
               </w:rPr>
-              <w:t> B2514E</w:t>
             </w:r>
           </w:p>
         </w:tc>
@@ -2469,7 +2387,7 @@
                 <w:spacing w:val="50"/>
                 <w:sz w:val="18"/>
               </w:rPr>
-              <w:t> </w:t>
+              <w:t xml:space="preserve"> </w:t>
             </w:r>
             <w:r>
               <w:rPr>
@@ -2486,7 +2404,7 @@
                 <w:spacing w:val="52"/>
                 <w:sz w:val="18"/>
               </w:rPr>
-              <w:t>  </w:t>
+              <w:t xml:space="preserve">  </w:t>
             </w:r>
             <w:r>
               <w:rPr>
@@ -2512,7 +2430,7 @@
                 <w:spacing w:val="-2"/>
                 <w:sz w:val="18"/>
               </w:rPr>
-              <w:t>NANJING</w:t>
+              <w:t>DA NANG, VIET NAM</w:t>
             </w:r>
           </w:p>
         </w:tc>
@@ -2574,7 +2492,7 @@
                 <w:spacing w:val="52"/>
                 <w:sz w:val="18"/>
               </w:rPr>
-              <w:t> </w:t>
+              <w:t xml:space="preserve"> </w:t>
             </w:r>
             <w:r>
               <w:rPr>
@@ -2591,7 +2509,7 @@
                 <w:spacing w:val="53"/>
                 <w:sz w:val="18"/>
               </w:rPr>
-              <w:t> </w:t>
+              <w:t xml:space="preserve"> </w:t>
             </w:r>
             <w:r>
               <w:rPr>
@@ -2615,21 +2533,19 @@
               <w:rPr>
                 <w:sz w:val="18"/>
               </w:rPr>
-              <w:t>GDANSK,</w:t>
+              <w:t>GDANSK, POLAND</w:t>
             </w:r>
             <w:r>
               <w:rPr>
                 <w:spacing w:val="-8"/>
                 <w:sz w:val="18"/>
               </w:rPr>
-              <w:t> </w:t>
             </w:r>
             <w:r>
               <w:rPr>
                 <w:spacing w:val="-2"/>
                 <w:sz w:val="18"/>
               </w:rPr>
-              <w:t>POLAND</w:t>
             </w:r>
           </w:p>
         </w:tc>
@@ -2671,7 +2587,7 @@
                 <w:w w:val="105"/>
                 <w:sz w:val="18"/>
               </w:rPr>
-              <w:t> </w:t>
+              <w:t xml:space="preserve"> </w:t>
             </w:r>
             <w:r>
               <w:rPr>
@@ -2690,7 +2606,7 @@
                 <w:w w:val="105"/>
                 <w:sz w:val="18"/>
               </w:rPr>
-              <w:t> </w:t>
+              <w:t xml:space="preserve"> </w:t>
             </w:r>
             <w:r>
               <w:rPr>
@@ -2717,7 +2633,7 @@
                 <w:spacing w:val="-2"/>
                 <w:sz w:val="18"/>
               </w:rPr>
-              <w:t>ODESA,UKRAINE</w:t>
+              <w:t>GDANSK, POLAND</w:t>
             </w:r>
           </w:p>
         </w:tc>
@@ -3207,42 +3123,36 @@
               <w:rPr>
                 <w:sz w:val="18"/>
               </w:rPr>
-              <w:t>200</w:t>
+              <w:t>29375 PCS  AS 1x40'HQ S.T.C. SHIPPER'S LOAD &amp; COUNT TYRES AND TUBES</w:t>
             </w:r>
             <w:r>
               <w:rPr>
                 <w:spacing w:val="-4"/>
                 <w:sz w:val="18"/>
               </w:rPr>
-              <w:t> </w:t>
             </w:r>
             <w:r>
               <w:rPr>
                 <w:spacing w:val="-2"/>
                 <w:sz w:val="18"/>
               </w:rPr>
-              <w:t>PACKAGES</w:t>
-            </w:r>
-            <w:r>
-              <w:rPr>
-                <w:sz w:val="18"/>
-              </w:rPr>
-              <w:tab/>
-              <w:t>SOLAR</w:t>
+            </w:r>
+            <w:r>
+              <w:rPr>
+                <w:sz w:val="18"/>
+              </w:rPr>
             </w:r>
             <w:r>
               <w:rPr>
                 <w:spacing w:val="-6"/>
                 <w:sz w:val="18"/>
               </w:rPr>
-              <w:t> </w:t>
             </w:r>
             <w:r>
               <w:rPr>
                 <w:spacing w:val="-2"/>
                 <w:sz w:val="18"/>
               </w:rPr>
-              <w:t>MODULES</w:t>
             </w:r>
           </w:p>
         </w:tc>
@@ -3264,21 +3174,19 @@
                 <w:spacing w:val="-2"/>
                 <w:sz w:val="18"/>
               </w:rPr>
-              <w:t>210800.000</w:t>
+              <w:t>19334.500 KGS</w:t>
             </w:r>
             <w:r>
               <w:rPr>
                 <w:spacing w:val="-13"/>
                 <w:sz w:val="18"/>
               </w:rPr>
-              <w:t> </w:t>
             </w:r>
             <w:r>
               <w:rPr>
                 <w:spacing w:val="-5"/>
                 <w:sz w:val="18"/>
               </w:rPr>
-              <w:t>KGS</w:t>
             </w:r>
           </w:p>
         </w:tc>
@@ -3299,21 +3207,19 @@
               <w:rPr>
                 <w:sz w:val="18"/>
               </w:rPr>
-              <w:t>680.000</w:t>
+              <w:t>76.000 CBM</w:t>
             </w:r>
             <w:r>
               <w:rPr>
                 <w:spacing w:val="-8"/>
                 <w:sz w:val="18"/>
               </w:rPr>
-              <w:t> </w:t>
             </w:r>
             <w:r>
               <w:rPr>
                 <w:spacing w:val="-5"/>
                 <w:sz w:val="18"/>
               </w:rPr>
-              <w:t>CBM</w:t>
             </w:r>
           </w:p>
         </w:tc>
@@ -3352,252 +3258,81 @@
       </w:pPr>
       <w:r>
         <w:rPr/>
-        <mc:AlternateContent>
-          <mc:Choice Requires="wps">
-            <w:drawing>
-              <wp:anchor distT="0" distB="0" distL="0" distR="0" allowOverlap="1" layoutInCell="1" locked="0" behindDoc="0" simplePos="0" relativeHeight="15728640">
-                <wp:simplePos x="0" y="0"/>
-                <wp:positionH relativeFrom="page">
-                  <wp:posOffset>5111750</wp:posOffset>
-                </wp:positionH>
-                <wp:positionV relativeFrom="paragraph">
-                  <wp:posOffset>56163</wp:posOffset>
-                </wp:positionV>
-                <wp:extent cx="2376170" cy="467995"/>
-                <wp:effectExtent l="0" t="0" r="0" b="0"/>
-                <wp:wrapNone/>
-                <wp:docPr id="2" name="Textbox 2"/>
-                <wp:cNvGraphicFramePr>
-                  <a:graphicFrameLocks/>
-                </wp:cNvGraphicFramePr>
-                <a:graphic>
-                  <a:graphicData uri="http://schemas.microsoft.com/office/word/2010/wordprocessingShape">
-                    <wps:wsp>
-                      <wps:cNvPr id="2" name="Textbox 2"/>
-                      <wps:cNvSpPr txBox="1"/>
-                      <wps:spPr>
-                        <a:xfrm>
-                          <a:off x="0" y="0"/>
-                          <a:ext cx="2376170" cy="467995"/>
-                        </a:xfrm>
-                        <a:prstGeom prst="rect">
-                          <a:avLst/>
-                        </a:prstGeom>
-                        <a:ln w="28575">
-                          <a:solidFill>
-                            <a:srgbClr val="7F7F7F"/>
-                          </a:solidFill>
-                          <a:prstDash val="solid"/>
-                        </a:ln>
-                      </wps:spPr>
-                      <wps:txbx>
-                        <w:txbxContent>
-                          <w:p>
-                            <w:pPr>
-                              <w:spacing w:before="166"/>
-                              <w:ind w:left="421" w:right="0" w:firstLine="0"/>
-                              <w:jc w:val="left"/>
-                              <w:rPr>
-                                <w:rFonts w:ascii="Cambria"/>
-                                <w:b/>
-                                <w:sz w:val="40"/>
-                              </w:rPr>
-                            </w:pPr>
-                            <w:r>
-                              <w:rPr>
-                                <w:rFonts w:ascii="Cambria"/>
-                                <w:b/>
-                                <w:color w:val="7F7F7F"/>
-                                <w:w w:val="85"/>
-                                <w:sz w:val="40"/>
-                              </w:rPr>
-                              <w:t>TELEX</w:t>
-                            </w:r>
-                            <w:r>
-                              <w:rPr>
-                                <w:rFonts w:ascii="Cambria"/>
-                                <w:b/>
-                                <w:color w:val="7F7F7F"/>
-                                <w:spacing w:val="43"/>
-                                <w:w w:val="150"/>
-                                <w:sz w:val="40"/>
-                              </w:rPr>
-                              <w:t> </w:t>
-                            </w:r>
-                            <w:r>
-                              <w:rPr>
-                                <w:rFonts w:ascii="Cambria"/>
-                                <w:b/>
-                                <w:color w:val="7F7F7F"/>
-                                <w:spacing w:val="-2"/>
-                                <w:w w:val="95"/>
-                                <w:sz w:val="40"/>
-                              </w:rPr>
-                              <w:t>RELEASED</w:t>
-                            </w:r>
-                          </w:p>
-                        </w:txbxContent>
-                      </wps:txbx>
-                      <wps:bodyPr wrap="square" lIns="0" tIns="0" rIns="0" bIns="0" rtlCol="0">
-                        <a:noAutofit/>
-                      </wps:bodyPr>
-                    </wps:wsp>
-                  </a:graphicData>
-                </a:graphic>
-              </wp:anchor>
-            </w:drawing>
-          </mc:Choice>
-          <mc:Fallback>
-            <w:pict>
-              <v:shapetype id="_x0000_t202" o:spt="202" coordsize="21600,21600" path="m,l,21600r21600,l21600,xe">
-                <v:stroke joinstyle="miter"/>
-                <v:path gradientshapeok="t" o:connecttype="rect"/>
-              </v:shapetype>
-              <v:shape style="position:absolute;margin-left:402.5pt;margin-top:4.422318pt;width:187.1pt;height:36.85pt;mso-position-horizontal-relative:page;mso-position-vertical-relative:paragraph;z-index:15728640" type="#_x0000_t202" id="docshape1" filled="false" stroked="true" strokeweight="2.25pt" strokecolor="#7f7f7f">
-                <v:textbox inset="0,0,0,0">
-                  <w:txbxContent>
-                    <w:p>
-                      <w:pPr>
-                        <w:spacing w:before="166"/>
-                        <w:ind w:left="421" w:right="0" w:firstLine="0"/>
-                        <w:jc w:val="left"/>
-                        <w:rPr>
-                          <w:rFonts w:ascii="Cambria"/>
-                          <w:b/>
-                          <w:sz w:val="40"/>
-                        </w:rPr>
-                      </w:pPr>
-                      <w:r>
-                        <w:rPr>
-                          <w:rFonts w:ascii="Cambria"/>
-                          <w:b/>
-                          <w:color w:val="7F7F7F"/>
-                          <w:w w:val="85"/>
-                          <w:sz w:val="40"/>
-                        </w:rPr>
-                        <w:t>TELEX</w:t>
-                      </w:r>
-                      <w:r>
-                        <w:rPr>
-                          <w:rFonts w:ascii="Cambria"/>
-                          <w:b/>
-                          <w:color w:val="7F7F7F"/>
-                          <w:spacing w:val="43"/>
-                          <w:w w:val="150"/>
-                          <w:sz w:val="40"/>
-                        </w:rPr>
-                        <w:t> </w:t>
-                      </w:r>
-                      <w:r>
-                        <w:rPr>
-                          <w:rFonts w:ascii="Cambria"/>
-                          <w:b/>
-                          <w:color w:val="7F7F7F"/>
-                          <w:spacing w:val="-2"/>
-                          <w:w w:val="95"/>
-                          <w:sz w:val="40"/>
-                        </w:rPr>
-                        <w:t>RELEASED</w:t>
-                      </w:r>
-                    </w:p>
-                  </w:txbxContent>
-                </v:textbox>
-                <v:stroke dashstyle="solid"/>
-                <w10:wrap type="none"/>
-              </v:shape>
-            </w:pict>
-          </mc:Fallback>
-        </mc:AlternateContent>
+        <w:t>CONTAINER/SEAL NO.:</w:t>
       </w:r>
       <w:r>
         <w:rPr/>
-        <w:t>MSBU8215380/</w:t>
+        <w:t xml:space="preserve"> </w:t>
       </w:r>
       <w:r>
         <w:rPr>
           <w:spacing w:val="-19"/>
         </w:rPr>
-        <w:t> </w:t>
       </w:r>
       <w:r>
         <w:rPr/>
-        <w:t>FX38997930/40HQ/20PACKAGES/21080KGS/68.00CBM/ </w:t>
+        <w:t>UETU8355694/ML-VN4987283/40HQ/29375 PCS/19334.500KGS/76.000CBM</w:t>
       </w:r>
       <w:r>
         <w:rPr>
           <w:spacing w:val="-2"/>
         </w:rPr>
-        <w:t>MSBU8215034/FX38997929/40HQ/20PACKAGES/21080KGS/68.00CBM/ </w:t>
       </w:r>
       <w:r>
         <w:rPr/>
-        <w:t>MSBU8216853/</w:t>
       </w:r>
       <w:r>
         <w:rPr>
           <w:spacing w:val="-19"/>
         </w:rPr>
-        <w:t> </w:t>
       </w:r>
       <w:r>
         <w:rPr/>
-        <w:t>FX38997931/40HQ/20PACKAGES/21080KGS/68.00CBM/ MSBU8217037/</w:t>
       </w:r>
       <w:r>
         <w:rPr>
           <w:spacing w:val="-19"/>
         </w:rPr>
-        <w:t> </w:t>
       </w:r>
       <w:r>
         <w:rPr/>
-        <w:t>FX38997938/40HQ/20PACKAGES/21080KGS/68.00CBM/ MSBU8218990/</w:t>
       </w:r>
       <w:r>
         <w:rPr>
           <w:spacing w:val="-19"/>
         </w:rPr>
-        <w:t> </w:t>
       </w:r>
       <w:r>
         <w:rPr/>
-        <w:t>FX38997937/40HQ/20PACKAGES/21080KGS/68.00CBM/ MSBU8209746/</w:t>
       </w:r>
       <w:r>
         <w:rPr>
           <w:spacing w:val="-19"/>
         </w:rPr>
-        <w:t> </w:t>
       </w:r>
       <w:r>
         <w:rPr/>
-        <w:t>FX38997933/40HQ/20PACKAGES/21080KGS/68.00CBM/ </w:t>
       </w:r>
       <w:r>
         <w:rPr>
           <w:spacing w:val="-2"/>
         </w:rPr>
-        <w:t>MSBU8213622/ FX38997932 /40HQ/20PACKAGES/21080KGS/68.00CBM/ MSBU8217314/ FX38997935 /40HQ/20PACKAGES/21080KGS/68.00CBM/ </w:t>
       </w:r>
       <w:r>
         <w:rPr/>
-        <w:t>MSBU8214418/</w:t>
       </w:r>
       <w:r>
         <w:rPr>
           <w:spacing w:val="-19"/>
         </w:rPr>
-        <w:t> </w:t>
       </w:r>
       <w:r>
         <w:rPr/>
-        <w:t>FX38997936/40HQ/20PACKAGES/21080KGS/68.00CBM/ </w:t>
       </w:r>
       <w:r>
         <w:rPr>
           <w:spacing w:val="-2"/>
         </w:rPr>
-        <w:t>MSBU8217870/ FX38997934 /40HQ/20PACKAGES/21080KGS/68.00CBM/</w:t>
       </w:r>
     </w:p>
     <w:p>
@@ -3615,6 +3350,13 @@
           <w:sz w:val="20"/>
         </w:rPr>
       </w:pPr>
+      <w:r>
+        <w:rPr>
+          <w:b/>
+          <w:sz w:val="18"/>
+        </w:rPr>
+        <w:t>SOUTHERN STAR INT'L LOGISTICS CO., LTD</w:t>
+      </w:r>
     </w:p>
     <w:p>
       <w:pPr>
@@ -3624,6 +3366,13 @@
           <w:sz w:val="20"/>
         </w:rPr>
       </w:pPr>
+      <w:r>
+        <w:rPr>
+          <w:b/>
+          <w:sz w:val="18"/>
+        </w:rPr>
+        <w:t>B/L TELEX RELEASE</w:t>
+      </w:r>
     </w:p>
     <w:p>
       <w:pPr>
@@ -3638,6 +3387,12 @@
           <w:pgMar w:top="180" w:bottom="0" w:left="141" w:right="0"/>
         </w:sectPr>
       </w:pPr>
+      <w:r>
+        <w:rPr>
+          <w:sz w:val="18"/>
+        </w:rPr>
+        <w:t>SAY TWENTY NINE THOUSAND THREE HUNDRED AND SEVENTY FIVE</w:t>
+      </w:r>
     </w:p>
     <w:p>
       <w:pPr>
@@ -3708,25 +3463,24 @@
       </w:pPr>
       <w:r>
         <w:rPr/>
-        <w:br w:type="column"/>
+        <w:t>*FREIGHT PREPAID*</w:t>
       </w:r>
       <w:r>
         <w:rPr>
           <w:spacing w:val="-2"/>
         </w:rPr>
-        <w:t>FREIGHT</w:t>
+        <w:t xml:space="preserve"> </w:t>
       </w:r>
       <w:r>
         <w:rPr>
           <w:spacing w:val="-25"/>
         </w:rPr>
-        <w:t> </w:t>
       </w:r>
       <w:r>
         <w:rPr>
           <w:spacing w:val="-2"/>
         </w:rPr>
-        <w:t>PREPAID 40HQ*10</w:t>
+        <w:t>1x40'HQ CY-CY</w:t>
       </w:r>
     </w:p>
     <w:p>
@@ -4265,7 +4019,6 @@
               <w:rPr>
                 <w:sz w:val="20"/>
               </w:rPr>
-              <w:t>27.03.2025</w:t>
             </w:r>
             <w:r>
               <w:rPr>
@@ -4279,7 +4032,6 @@
                 <w:spacing w:val="-2"/>
                 <w:sz w:val="20"/>
               </w:rPr>
-              <w:t>NANJING</w:t>
             </w:r>
           </w:p>
         </w:tc>
@@ -4347,7 +4099,6 @@
                 <w:spacing w:val="-2"/>
                 <w:sz w:val="18"/>
               </w:rPr>
-              <w:t>MEDUGJ165539</w:t>
             </w:r>
           </w:p>
         </w:tc>
@@ -4439,6 +4190,14 @@
                 <w:sz w:val="20"/>
               </w:rPr>
               <w:t>B(s)/L</w:t>
+            </w:r>
+          </w:p>
+          <w:p>
+            <w:r>
+              <w:rPr>
+                <w:sz w:val="18"/>
+              </w:rPr>
+              <w:t>0 / ZERO</w:t>
             </w:r>
           </w:p>
         </w:tc>
@@ -4622,6 +4381,14 @@
                 <w:sz w:val="18"/>
               </w:rPr>
               <w:t>VESSEL</w:t>
+            </w:r>
+          </w:p>
+          <w:p>
+            <w:r>
+              <w:rPr>
+                <w:sz w:val="18"/>
+              </w:rPr>
+              <w:t>2026-02-02</w:t>
             </w:r>
           </w:p>
         </w:tc>

</xml_diff>